<commit_message>
Diagrama de secuencia y componentes
</commit_message>
<xml_diff>
--- a/Documento de Diseño.docx
+++ b/Documento de Diseño.docx
@@ -14,10 +14,26 @@
     </w:p>
     <w:p>
       <w:r>
-        <w:t xml:space="preserve">La elección se basa en los requisitos organiztivos del enunciado, que exige la </w:t>
-      </w:r>
-      <w:r>
-        <w:t>división del sistema en dos subsistemas independientes desarrollados por subequipos distintos.</w:t>
+        <w:t xml:space="preserve">La elección se basa en los requisitos </w:t>
+      </w:r>
+      <w:proofErr w:type="spellStart"/>
+      <w:r>
+        <w:t>organiztivos</w:t>
+      </w:r>
+      <w:proofErr w:type="spellEnd"/>
+      <w:r>
+        <w:t xml:space="preserve"> del enunciado, que exige la </w:t>
+      </w:r>
+      <w:r>
+        <w:t xml:space="preserve">división del sistema en dos subsistemas independientes desarrollados por </w:t>
+      </w:r>
+      <w:proofErr w:type="spellStart"/>
+      <w:r>
+        <w:t>subequipos</w:t>
+      </w:r>
+      <w:proofErr w:type="spellEnd"/>
+      <w:r>
+        <w:t xml:space="preserve"> distintos.</w:t>
       </w:r>
     </w:p>
     <w:p>
@@ -29,7 +45,15 @@
         </w:numPr>
       </w:pPr>
       <w:r>
-        <w:t>Desacoplamiento Tecnológico: Permite que el subsistema de Inteligencia (Backend) utilice Python por su madurez en Ciencia de Datos, mientras que el subsistema de Visualización (Frontend) puede usar tecnologías web estándar (HTML/JS/React) sin dependencias cruzadas.</w:t>
+        <w:t>Desacoplamiento Tecnológico: Permite que el subsistema de Inteligencia (Backend) utilice Python por su madurez en Ciencia de Datos, mientras que el subsistema de Visualización (Frontend) puede usar tecnologías web estándar (HTML/JS/</w:t>
+      </w:r>
+      <w:proofErr w:type="spellStart"/>
+      <w:r>
+        <w:t>React</w:t>
+      </w:r>
+      <w:proofErr w:type="spellEnd"/>
+      <w:r>
+        <w:t>) sin dependencias cruzadas.</w:t>
       </w:r>
     </w:p>
     <w:p>
@@ -41,7 +65,15 @@
         </w:numPr>
       </w:pPr>
       <w:r>
-        <w:t>Escalabilidad Independiente: En un entorno real de Industria 4.0, el motor de inferencia de Machine Learning puede requerir mayor potencia de cómputo (GPU/CPU) que la interfaz de usuario. Esta arquitectura permite escalar el backend sin desperdiciar recursos en el frontend.</w:t>
+        <w:t xml:space="preserve">Escalabilidad Independiente: En un entorno real de Industria 4.0, el motor de inferencia de Machine </w:t>
+      </w:r>
+      <w:proofErr w:type="spellStart"/>
+      <w:r>
+        <w:t>Learning</w:t>
+      </w:r>
+      <w:proofErr w:type="spellEnd"/>
+      <w:r>
+        <w:t xml:space="preserve"> puede requerir mayor potencia de cómputo (GPU/CPU) que la interfaz de usuario. Esta arquitectura permite escalar el backend sin desperdiciar recursos en el frontend.</w:t>
       </w:r>
     </w:p>
     <w:p>
@@ -72,23 +104,55 @@
     </w:p>
     <w:p>
       <w:r>
-        <w:t>Se ha aplicado el Patrón de Diseño Strategy en el Subsistema de Inteligencia.</w:t>
-      </w:r>
-    </w:p>
-    <w:p>
-      <w:r>
-        <w:t>En el mantenimiento predictivo, los algoritmos de detección de anomalías evolucionan constantemente. Hoy utilizamos un Random Forest, pero mañana podríamos necesitar una Red Neuronal (LSTM) o un Isolation Forest.</w:t>
+        <w:t xml:space="preserve">Se ha aplicado el Patrón de Diseño </w:t>
+      </w:r>
+      <w:proofErr w:type="spellStart"/>
+      <w:r>
+        <w:t>Strategy</w:t>
+      </w:r>
+      <w:proofErr w:type="spellEnd"/>
+      <w:r>
+        <w:t xml:space="preserve"> en el Subsistema de Inteligencia.</w:t>
+      </w:r>
+    </w:p>
+    <w:p>
+      <w:r>
+        <w:t xml:space="preserve">En el mantenimiento predictivo, los algoritmos de detección de anomalías evolucionan constantemente. Hoy utilizamos un Random Forest, pero mañana podríamos necesitar una Red Neuronal (LSTM) o un </w:t>
+      </w:r>
+      <w:proofErr w:type="spellStart"/>
+      <w:r>
+        <w:t>Isolation</w:t>
+      </w:r>
+      <w:proofErr w:type="spellEnd"/>
+      <w:r>
+        <w:t xml:space="preserve"> Forest.</w:t>
       </w:r>
     </w:p>
     <w:p/>
     <w:p>
       <w:r>
-        <w:t>3. Definición de la Interfaz de Comunicación (API Contract)</w:t>
-      </w:r>
-    </w:p>
-    <w:p>
-      <w:r>
-        <w:t>Para garantizar la independencia de los subsistemas, se define el siguiente estandar de comunicación:</w:t>
+        <w:t xml:space="preserve">3. Definición de la Interfaz de Comunicación (API </w:t>
+      </w:r>
+      <w:proofErr w:type="spellStart"/>
+      <w:r>
+        <w:t>Contract</w:t>
+      </w:r>
+      <w:proofErr w:type="spellEnd"/>
+      <w:r>
+        <w:t>)</w:t>
+      </w:r>
+    </w:p>
+    <w:p>
+      <w:r>
+        <w:t xml:space="preserve">Para garantizar la independencia de los subsistemas, se define el siguiente </w:t>
+      </w:r>
+      <w:proofErr w:type="spellStart"/>
+      <w:r>
+        <w:t>estandar</w:t>
+      </w:r>
+      <w:proofErr w:type="spellEnd"/>
+      <w:r>
+        <w:t xml:space="preserve"> de comunicación:</w:t>
       </w:r>
     </w:p>
     <w:tbl>
@@ -304,13 +368,22 @@
             <w:hideMark/>
           </w:tcPr>
           <w:p>
+            <w:proofErr w:type="spellStart"/>
             <w:r>
               <w:rPr>
                 <w:b/>
                 <w:bCs/>
               </w:rPr>
               <w:lastRenderedPageBreak/>
-              <w:t>Endpoint Principal</w:t>
+              <w:t>Endpoint</w:t>
+            </w:r>
+            <w:proofErr w:type="spellEnd"/>
+            <w:r>
+              <w:rPr>
+                <w:b/>
+                <w:bCs/>
+              </w:rPr>
+              <w:t xml:space="preserve"> Principal</w:t>
             </w:r>
           </w:p>
         </w:tc>
@@ -334,8 +407,13 @@
           </w:tcPr>
           <w:p>
             <w:r>
-              <w:t>POST /predict</w:t>
-            </w:r>
+              <w:t>POST /</w:t>
+            </w:r>
+            <w:proofErr w:type="spellStart"/>
+            <w:r>
+              <w:t>predict</w:t>
+            </w:r>
+            <w:proofErr w:type="spellEnd"/>
           </w:p>
         </w:tc>
       </w:tr>
@@ -391,7 +469,31 @@
           </w:tcPr>
           <w:p>
             <w:r>
-              <w:t>{"temperatura": float, "vibracion": float}</w:t>
+              <w:t xml:space="preserve">{"temperatura": </w:t>
+            </w:r>
+            <w:proofErr w:type="spellStart"/>
+            <w:r>
+              <w:t>float</w:t>
+            </w:r>
+            <w:proofErr w:type="spellEnd"/>
+            <w:r>
+              <w:t>, "</w:t>
+            </w:r>
+            <w:proofErr w:type="spellStart"/>
+            <w:r>
+              <w:t>vibracion</w:t>
+            </w:r>
+            <w:proofErr w:type="spellEnd"/>
+            <w:r>
+              <w:t xml:space="preserve">": </w:t>
+            </w:r>
+            <w:proofErr w:type="spellStart"/>
+            <w:r>
+              <w:t>float</w:t>
+            </w:r>
+            <w:proofErr w:type="spellEnd"/>
+            <w:r>
+              <w:t>}</w:t>
             </w:r>
           </w:p>
         </w:tc>
@@ -448,7 +550,31 @@
           </w:tcPr>
           <w:p>
             <w:r>
-              <w:t>{"probabilidad_fallo": float, "estado": string}</w:t>
+              <w:t>{"</w:t>
+            </w:r>
+            <w:proofErr w:type="spellStart"/>
+            <w:r>
+              <w:t>probabilidad_fallo</w:t>
+            </w:r>
+            <w:proofErr w:type="spellEnd"/>
+            <w:r>
+              <w:t xml:space="preserve">": </w:t>
+            </w:r>
+            <w:proofErr w:type="spellStart"/>
+            <w:r>
+              <w:t>float</w:t>
+            </w:r>
+            <w:proofErr w:type="spellEnd"/>
+            <w:r>
+              <w:t xml:space="preserve">, "estado": </w:t>
+            </w:r>
+            <w:proofErr w:type="spellStart"/>
+            <w:r>
+              <w:t>string</w:t>
+            </w:r>
+            <w:proofErr w:type="spellEnd"/>
+            <w:r>
+              <w:t>}</w:t>
             </w:r>
           </w:p>
         </w:tc>
@@ -467,7 +593,31 @@
     </w:p>
     <w:p>
       <w:r>
-        <w:t>Cada endpoint y el cargador del modelo deben tener tests independientes usando pytest.</w:t>
+        <w:t xml:space="preserve">Cada </w:t>
+      </w:r>
+      <w:proofErr w:type="spellStart"/>
+      <w:r>
+        <w:t>endpoint</w:t>
+      </w:r>
+      <w:proofErr w:type="spellEnd"/>
+      <w:r>
+        <w:t xml:space="preserve"> y el cargador del modelo deben tener </w:t>
+      </w:r>
+      <w:proofErr w:type="spellStart"/>
+      <w:r>
+        <w:t>tests</w:t>
+      </w:r>
+      <w:proofErr w:type="spellEnd"/>
+      <w:r>
+        <w:t xml:space="preserve"> independientes usando </w:t>
+      </w:r>
+      <w:proofErr w:type="spellStart"/>
+      <w:r>
+        <w:t>pytest</w:t>
+      </w:r>
+      <w:proofErr w:type="spellEnd"/>
+      <w:r>
+        <w:t>.</w:t>
       </w:r>
     </w:p>
     <w:p>
@@ -477,7 +627,15 @@
     </w:p>
     <w:p>
       <w:r>
-        <w:t>El despliegue será automático en la rama main siempre que las pruebas de integración pasen satisfactoriamente.</w:t>
+        <w:t xml:space="preserve">El despliegue será automático en la rama </w:t>
+      </w:r>
+      <w:proofErr w:type="spellStart"/>
+      <w:r>
+        <w:t>main</w:t>
+      </w:r>
+      <w:proofErr w:type="spellEnd"/>
+      <w:r>
+        <w:t xml:space="preserve"> siempre que las pruebas de integración pasen satisfactoriamente.</w:t>
       </w:r>
     </w:p>
     <w:p/>
@@ -495,6 +653,9 @@
     </w:p>
     <w:p>
       <w:r>
+        <w:rPr>
+          <w:noProof/>
+        </w:rPr>
         <w:drawing>
           <wp:inline distT="0" distB="0" distL="0" distR="0" wp14:anchorId="2CD3BED0" wp14:editId="225B3272">
             <wp:extent cx="5400040" cy="1986915"/>
@@ -541,6 +702,9 @@
     </w:p>
     <w:p>
       <w:r>
+        <w:rPr>
+          <w:noProof/>
+        </w:rPr>
         <w:lastRenderedPageBreak/>
         <w:drawing>
           <wp:inline distT="0" distB="0" distL="0" distR="0" wp14:anchorId="32FA8FB8" wp14:editId="7EDBD02C">
@@ -567,6 +731,115 @@
                     <a:xfrm>
                       <a:off x="0" y="0"/>
                       <a:ext cx="5400040" cy="6929120"/>
+                    </a:xfrm>
+                    <a:prstGeom prst="rect">
+                      <a:avLst/>
+                    </a:prstGeom>
+                  </pic:spPr>
+                </pic:pic>
+              </a:graphicData>
+            </a:graphic>
+          </wp:inline>
+        </w:drawing>
+      </w:r>
+    </w:p>
+    <w:p/>
+    <w:p/>
+    <w:p/>
+    <w:p>
+      <w:r>
+        <w:lastRenderedPageBreak/>
+        <w:t>Diagrama de Secuencia</w:t>
+      </w:r>
+      <w:r>
+        <w:rPr>
+          <w:noProof/>
+        </w:rPr>
+        <w:drawing>
+          <wp:inline distT="0" distB="0" distL="0" distR="0" wp14:anchorId="37CE67EF" wp14:editId="72E037DD">
+            <wp:extent cx="5400040" cy="4849495"/>
+            <wp:effectExtent l="0" t="0" r="0" b="8255"/>
+            <wp:docPr id="2004241384" name="Imagen 1"/>
+            <wp:cNvGraphicFramePr>
+              <a:graphicFrameLocks xmlns:a="http://schemas.openxmlformats.org/drawingml/2006/main" noChangeAspect="1"/>
+            </wp:cNvGraphicFramePr>
+            <a:graphic xmlns:a="http://schemas.openxmlformats.org/drawingml/2006/main">
+              <a:graphicData uri="http://schemas.openxmlformats.org/drawingml/2006/picture">
+                <pic:pic xmlns:pic="http://schemas.openxmlformats.org/drawingml/2006/picture">
+                  <pic:nvPicPr>
+                    <pic:cNvPr id="2004241384" name="Imagen 2004241384"/>
+                    <pic:cNvPicPr/>
+                  </pic:nvPicPr>
+                  <pic:blipFill>
+                    <a:blip r:embed="rId7">
+                      <a:extLst>
+                        <a:ext uri="{28A0092B-C50C-407E-A947-70E740481C1C}">
+                          <a14:useLocalDpi xmlns:a14="http://schemas.microsoft.com/office/drawing/2010/main" val="0"/>
+                        </a:ext>
+                      </a:extLst>
+                    </a:blip>
+                    <a:stretch>
+                      <a:fillRect/>
+                    </a:stretch>
+                  </pic:blipFill>
+                  <pic:spPr>
+                    <a:xfrm>
+                      <a:off x="0" y="0"/>
+                      <a:ext cx="5400040" cy="4849495"/>
+                    </a:xfrm>
+                    <a:prstGeom prst="rect">
+                      <a:avLst/>
+                    </a:prstGeom>
+                  </pic:spPr>
+                </pic:pic>
+              </a:graphicData>
+            </a:graphic>
+          </wp:inline>
+        </w:drawing>
+      </w:r>
+    </w:p>
+    <w:p>
+      <w:r>
+        <w:t>Diagrama de componentes:</w:t>
+      </w:r>
+    </w:p>
+    <w:p>
+      <w:r>
+        <w:rPr>
+          <w:noProof/>
+        </w:rPr>
+        <w:lastRenderedPageBreak/>
+        <w:drawing>
+          <wp:inline distT="0" distB="0" distL="0" distR="0" wp14:anchorId="68D3561A" wp14:editId="60C8AD4F">
+            <wp:extent cx="5400040" cy="3651885"/>
+            <wp:effectExtent l="0" t="0" r="0" b="5715"/>
+            <wp:docPr id="1330378383" name="Imagen 2"/>
+            <wp:cNvGraphicFramePr>
+              <a:graphicFrameLocks xmlns:a="http://schemas.openxmlformats.org/drawingml/2006/main" noChangeAspect="1"/>
+            </wp:cNvGraphicFramePr>
+            <a:graphic xmlns:a="http://schemas.openxmlformats.org/drawingml/2006/main">
+              <a:graphicData uri="http://schemas.openxmlformats.org/drawingml/2006/picture">
+                <pic:pic xmlns:pic="http://schemas.openxmlformats.org/drawingml/2006/picture">
+                  <pic:nvPicPr>
+                    <pic:cNvPr id="1330378383" name="Imagen 1330378383"/>
+                    <pic:cNvPicPr/>
+                  </pic:nvPicPr>
+                  <pic:blipFill>
+                    <a:blip r:embed="rId8">
+                      <a:extLst>
+                        <a:ext uri="{28A0092B-C50C-407E-A947-70E740481C1C}">
+                          <a14:useLocalDpi xmlns:a14="http://schemas.microsoft.com/office/drawing/2010/main" val="0"/>
+                        </a:ext>
+                      </a:extLst>
+                    </a:blip>
+                    <a:stretch>
+                      <a:fillRect/>
+                    </a:stretch>
+                  </pic:blipFill>
+                  <pic:spPr>
+                    <a:xfrm>
+                      <a:off x="0" y="0"/>
+                      <a:ext cx="5400040" cy="3651885"/>
                     </a:xfrm>
                     <a:prstGeom prst="rect">
                       <a:avLst/>

</xml_diff>

<commit_message>
Documento de diseño actualizado
</commit_message>
<xml_diff>
--- a/Documento de Diseño.docx
+++ b/Documento de Diseño.docx
@@ -747,19 +747,26 @@
     <w:p/>
     <w:p/>
     <w:p>
-      <w:r>
-        <w:lastRenderedPageBreak/>
-        <w:t>Diagrama de Secuencia</w:t>
-      </w:r>
-      <w:r>
+      <w:pPr>
         <w:rPr>
           <w:noProof/>
         </w:rPr>
+      </w:pPr>
+      <w:r>
+        <w:t>Diagrama de Secuencia</w:t>
+      </w:r>
+    </w:p>
+    <w:p>
+      <w:r>
+        <w:rPr>
+          <w:noProof/>
+        </w:rPr>
+        <w:lastRenderedPageBreak/>
         <w:drawing>
-          <wp:inline distT="0" distB="0" distL="0" distR="0" wp14:anchorId="37CE67EF" wp14:editId="72E037DD">
-            <wp:extent cx="5400040" cy="4849495"/>
-            <wp:effectExtent l="0" t="0" r="0" b="8255"/>
-            <wp:docPr id="2004241384" name="Imagen 1"/>
+          <wp:inline distT="0" distB="0" distL="0" distR="0" wp14:anchorId="3BF61039" wp14:editId="0AFD36E9">
+            <wp:extent cx="5400040" cy="3846195"/>
+            <wp:effectExtent l="0" t="0" r="0" b="1905"/>
+            <wp:docPr id="1248157331" name="Imagen 1"/>
             <wp:cNvGraphicFramePr>
               <a:graphicFrameLocks xmlns:a="http://schemas.openxmlformats.org/drawingml/2006/main" noChangeAspect="1"/>
             </wp:cNvGraphicFramePr>
@@ -767,7 +774,7 @@
               <a:graphicData uri="http://schemas.openxmlformats.org/drawingml/2006/picture">
                 <pic:pic xmlns:pic="http://schemas.openxmlformats.org/drawingml/2006/picture">
                   <pic:nvPicPr>
-                    <pic:cNvPr id="2004241384" name="Imagen 2004241384"/>
+                    <pic:cNvPr id="1248157331" name="Imagen 1248157331"/>
                     <pic:cNvPicPr/>
                   </pic:nvPicPr>
                   <pic:blipFill>
@@ -785,7 +792,7 @@
                   <pic:spPr>
                     <a:xfrm>
                       <a:off x="0" y="0"/>
-                      <a:ext cx="5400040" cy="4849495"/>
+                      <a:ext cx="5400040" cy="3846195"/>
                     </a:xfrm>
                     <a:prstGeom prst="rect">
                       <a:avLst/>
@@ -808,12 +815,11 @@
         <w:rPr>
           <w:noProof/>
         </w:rPr>
-        <w:lastRenderedPageBreak/>
         <w:drawing>
-          <wp:inline distT="0" distB="0" distL="0" distR="0" wp14:anchorId="68D3561A" wp14:editId="60C8AD4F">
-            <wp:extent cx="5400040" cy="3651885"/>
-            <wp:effectExtent l="0" t="0" r="0" b="5715"/>
-            <wp:docPr id="1330378383" name="Imagen 2"/>
+          <wp:inline distT="0" distB="0" distL="0" distR="0" wp14:anchorId="0DF9874E" wp14:editId="417B2AF5">
+            <wp:extent cx="5400040" cy="3108325"/>
+            <wp:effectExtent l="0" t="0" r="0" b="0"/>
+            <wp:docPr id="924183683" name="Imagen 2"/>
             <wp:cNvGraphicFramePr>
               <a:graphicFrameLocks xmlns:a="http://schemas.openxmlformats.org/drawingml/2006/main" noChangeAspect="1"/>
             </wp:cNvGraphicFramePr>
@@ -821,7 +827,7 @@
               <a:graphicData uri="http://schemas.openxmlformats.org/drawingml/2006/picture">
                 <pic:pic xmlns:pic="http://schemas.openxmlformats.org/drawingml/2006/picture">
                   <pic:nvPicPr>
-                    <pic:cNvPr id="1330378383" name="Imagen 1330378383"/>
+                    <pic:cNvPr id="924183683" name="Imagen 924183683"/>
                     <pic:cNvPicPr/>
                   </pic:nvPicPr>
                   <pic:blipFill>
@@ -839,7 +845,7 @@
                   <pic:spPr>
                     <a:xfrm>
                       <a:off x="0" y="0"/>
-                      <a:ext cx="5400040" cy="3651885"/>
+                      <a:ext cx="5400040" cy="3108325"/>
                     </a:xfrm>
                     <a:prstGeom prst="rect">
                       <a:avLst/>

</xml_diff>